<commit_message>
Edit functionality vs Word keyboard mapping
</commit_message>
<xml_diff>
--- a/crates/tw-layout/fixtures/word_baselines/floats_square/sample.docx
+++ b/crates/tw-layout/fixtures/word_baselines/floats_square/sample.docx
@@ -206,6 +206,18 @@
       <w:szCs w:val="18"/>
     </w:rPr>
   </w:style>
+  <w:style w:type="paragraph" w:styleId="Quote">
+    <w:name w:val="Quote"/>
+    <w:basedOn w:val="Normal"/>
+    <w:next w:val="Normal"/>
+    <w:pPr>
+      <w:spacing w:before="120" w:after="120"/>
+      <w:ind w:left="720" w:right="720"/>
+    </w:pPr>
+    <w:rPr>
+      <w:i/>
+    </w:rPr>
+  </w:style>
   <w:style w:type="paragraph" w:styleId="Caption">
     <w:name w:val="Caption"/>
     <w:basedOn w:val="Normal"/>
@@ -220,17 +232,5 @@
       <w:szCs w:val="18"/>
     </w:rPr>
   </w:style>
-  <w:style w:type="paragraph" w:styleId="Quote">
-    <w:name w:val="Quote"/>
-    <w:basedOn w:val="Normal"/>
-    <w:next w:val="Normal"/>
-    <w:pPr>
-      <w:spacing w:before="120" w:after="120"/>
-      <w:ind w:left="720" w:right="720"/>
-    </w:pPr>
-    <w:rPr>
-      <w:i/>
-    </w:rPr>
-  </w:style>
 </w:styles>
 </file>
</xml_diff>